<commit_message>
Ajout frontend et backend
</commit_message>
<xml_diff>
--- a/Descriptif_commandes.docx
+++ b/Descriptif_commandes.docx
@@ -15,6 +15,7 @@
           <w:lang w:val="en-US"/>
         </w:rPr>
       </w:pPr>
+      <w:proofErr w:type="gramStart"/>
       <w:r>
         <w:rPr>
           <w:b/>
@@ -28,6 +29,7 @@
         </w:rPr>
         <w:t>AWB :</w:t>
       </w:r>
+      <w:proofErr w:type="gramEnd"/>
       <w:r>
         <w:rPr>
           <w:b/>
@@ -53,7 +55,35 @@
           <w:lang w:val="en-US"/>
         </w:rPr>
         <w:br/>
-        <w:t xml:space="preserve">Non Reg : </w:t>
+        <w:t xml:space="preserve">Non </w:t>
+      </w:r>
+      <w:proofErr w:type="gramStart"/>
+      <w:r>
+        <w:rPr>
+          <w:b/>
+          <w:bCs/>
+          <w:i/>
+          <w:iCs/>
+          <w:color w:val="EE0000"/>
+          <w:sz w:val="28"/>
+          <w:szCs w:val="28"/>
+          <w:lang w:val="en-US"/>
+        </w:rPr>
+        <w:t>Reg :</w:t>
+      </w:r>
+      <w:proofErr w:type="gramEnd"/>
+      <w:r>
+        <w:rPr>
+          <w:b/>
+          <w:bCs/>
+          <w:i/>
+          <w:iCs/>
+          <w:color w:val="EE0000"/>
+          <w:sz w:val="28"/>
+          <w:szCs w:val="28"/>
+          <w:lang w:val="en-US"/>
+        </w:rPr>
+        <w:t xml:space="preserve"> </w:t>
       </w:r>
     </w:p>
     <w:p>
@@ -82,6 +112,7 @@
         <w:br/>
         <w:t>.\scripts\launch_non_regression.ps1 -Project AWB -Module MegaCommon</w:t>
       </w:r>
+      <w:proofErr w:type="gramStart"/>
       <w:r>
         <w:rPr>
           <w:b/>
@@ -97,8 +128,29 @@
           <w:highlight w:val="yellow"/>
           <w:lang w:val="en-US"/>
         </w:rPr>
-        <w:t>( ok )</w:t>
-      </w:r>
+        <w:t>(</w:t>
+      </w:r>
+      <w:proofErr w:type="gramEnd"/>
+      <w:r>
+        <w:rPr>
+          <w:b/>
+          <w:bCs/>
+          <w:highlight w:val="yellow"/>
+          <w:lang w:val="en-US"/>
+        </w:rPr>
+        <w:t xml:space="preserve"> </w:t>
+      </w:r>
+      <w:proofErr w:type="gramStart"/>
+      <w:r>
+        <w:rPr>
+          <w:b/>
+          <w:bCs/>
+          <w:highlight w:val="yellow"/>
+          <w:lang w:val="en-US"/>
+        </w:rPr>
+        <w:t>ok )</w:t>
+      </w:r>
+      <w:proofErr w:type="gramEnd"/>
       <w:r>
         <w:rPr>
           <w:b/>
@@ -158,6 +210,7 @@
         </w:rPr>
         <w:t xml:space="preserve"> </w:t>
       </w:r>
+      <w:proofErr w:type="gramStart"/>
       <w:r>
         <w:rPr>
           <w:b/>
@@ -165,7 +218,17 @@
           <w:highlight w:val="yellow"/>
           <w:lang w:val="en-US"/>
         </w:rPr>
-        <w:t>( ok )</w:t>
+        <w:t>( ok</w:t>
+      </w:r>
+      <w:proofErr w:type="gramEnd"/>
+      <w:r>
+        <w:rPr>
+          <w:b/>
+          <w:bCs/>
+          <w:highlight w:val="yellow"/>
+          <w:lang w:val="en-US"/>
+        </w:rPr>
+        <w:t xml:space="preserve"> )</w:t>
       </w:r>
     </w:p>
     <w:p>
@@ -203,6 +266,7 @@
         <w:br/>
         <w:t>.\scripts\launch_non_regression.ps1 -Project AWB -Module MegaCor</w:t>
       </w:r>
+      <w:proofErr w:type="gramStart"/>
       <w:r>
         <w:rPr>
           <w:b/>
@@ -218,8 +282,29 @@
           <w:highlight w:val="yellow"/>
           <w:lang w:val="en-US"/>
         </w:rPr>
-        <w:t>( ok )</w:t>
-      </w:r>
+        <w:t>(</w:t>
+      </w:r>
+      <w:proofErr w:type="gramEnd"/>
+      <w:r>
+        <w:rPr>
+          <w:b/>
+          <w:bCs/>
+          <w:highlight w:val="yellow"/>
+          <w:lang w:val="en-US"/>
+        </w:rPr>
+        <w:t xml:space="preserve"> </w:t>
+      </w:r>
+      <w:proofErr w:type="gramStart"/>
+      <w:r>
+        <w:rPr>
+          <w:b/>
+          <w:bCs/>
+          <w:highlight w:val="yellow"/>
+          <w:lang w:val="en-US"/>
+        </w:rPr>
+        <w:t>ok )</w:t>
+      </w:r>
+      <w:proofErr w:type="gramEnd"/>
     </w:p>
     <w:p>
       <w:pPr>
@@ -257,6 +342,7 @@
         <w:t xml:space="preserve">.\scripts\launch_non_regression.ps1 -Project AWB -Module </w:t>
       </w:r>
       <w:proofErr w:type="spellStart"/>
+      <w:proofErr w:type="gramStart"/>
       <w:r>
         <w:rPr>
           <w:b/>
@@ -281,8 +367,29 @@
           <w:highlight w:val="yellow"/>
           <w:lang w:val="en-US"/>
         </w:rPr>
-        <w:t>( ok )</w:t>
-      </w:r>
+        <w:t>(</w:t>
+      </w:r>
+      <w:proofErr w:type="gramEnd"/>
+      <w:r>
+        <w:rPr>
+          <w:b/>
+          <w:bCs/>
+          <w:highlight w:val="yellow"/>
+          <w:lang w:val="en-US"/>
+        </w:rPr>
+        <w:t xml:space="preserve"> </w:t>
+      </w:r>
+      <w:proofErr w:type="gramStart"/>
+      <w:r>
+        <w:rPr>
+          <w:b/>
+          <w:bCs/>
+          <w:highlight w:val="yellow"/>
+          <w:lang w:val="en-US"/>
+        </w:rPr>
+        <w:t>ok )</w:t>
+      </w:r>
+      <w:proofErr w:type="gramEnd"/>
     </w:p>
     <w:p>
       <w:pPr>
@@ -309,7 +416,16 @@
           <w:lang w:val="en-US"/>
         </w:rPr>
         <w:br/>
-        <w:t>.\scripts\launch_non_regression.ps1 -Project AWB -Module MegaTrade</w:t>
+        <w:t xml:space="preserve">.\scripts\launch_non_regression.ps1 -Project AWB -Module </w:t>
+      </w:r>
+      <w:proofErr w:type="gramStart"/>
+      <w:r>
+        <w:rPr>
+          <w:b/>
+          <w:bCs/>
+          <w:lang w:val="en-US"/>
+        </w:rPr>
+        <w:t>MegaTrade</w:t>
       </w:r>
       <w:r>
         <w:rPr>
@@ -326,8 +442,29 @@
           <w:highlight w:val="yellow"/>
           <w:lang w:val="en-US"/>
         </w:rPr>
-        <w:t>( ok )</w:t>
-      </w:r>
+        <w:t>(</w:t>
+      </w:r>
+      <w:proofErr w:type="gramEnd"/>
+      <w:r>
+        <w:rPr>
+          <w:b/>
+          <w:bCs/>
+          <w:highlight w:val="yellow"/>
+          <w:lang w:val="en-US"/>
+        </w:rPr>
+        <w:t xml:space="preserve"> </w:t>
+      </w:r>
+      <w:proofErr w:type="gramStart"/>
+      <w:r>
+        <w:rPr>
+          <w:b/>
+          <w:bCs/>
+          <w:highlight w:val="yellow"/>
+          <w:lang w:val="en-US"/>
+        </w:rPr>
+        <w:t>ok )</w:t>
+      </w:r>
+      <w:proofErr w:type="gramEnd"/>
     </w:p>
     <w:p>
       <w:pPr>
@@ -374,6 +511,7 @@
         </w:rPr>
         <w:br/>
       </w:r>
+      <w:proofErr w:type="gramStart"/>
       <w:r>
         <w:rPr>
           <w:b/>
@@ -383,7 +521,19 @@
           <w:color w:val="00B050"/>
           <w:lang w:val="en-US"/>
         </w:rPr>
-        <w:t>Custody : </w:t>
+        <w:t>Custody :</w:t>
+      </w:r>
+      <w:proofErr w:type="gramEnd"/>
+      <w:r>
+        <w:rPr>
+          <w:b/>
+          <w:bCs/>
+          <w:i/>
+          <w:iCs/>
+          <w:color w:val="00B050"/>
+          <w:lang w:val="en-US"/>
+        </w:rPr>
+        <w:t> </w:t>
       </w:r>
       <w:r>
         <w:rPr>
@@ -415,8 +565,9 @@
           <w:color w:val="0E2841" w:themeColor="text2"/>
           <w:lang w:val="en-US"/>
         </w:rPr>
-        <w:t xml:space="preserve">MegaCustody    </w:t>
-      </w:r>
+        <w:t xml:space="preserve">MegaCustody   </w:t>
+      </w:r>
+      <w:proofErr w:type="gramStart"/>
       <w:r>
         <w:rPr>
           <w:b/>
@@ -426,6 +577,17 @@
           <w:color w:val="0E2841" w:themeColor="text2"/>
           <w:lang w:val="en-US"/>
         </w:rPr>
+        <w:t xml:space="preserve"> </w:t>
+      </w:r>
+      <w:r>
+        <w:rPr>
+          <w:b/>
+          <w:bCs/>
+          <w:i/>
+          <w:iCs/>
+          <w:color w:val="0E2841" w:themeColor="text2"/>
+          <w:lang w:val="en-US"/>
+        </w:rPr>
         <w:t xml:space="preserve">  </w:t>
       </w:r>
       <w:r>
@@ -435,8 +597,29 @@
           <w:highlight w:val="yellow"/>
           <w:lang w:val="en-US"/>
         </w:rPr>
-        <w:t>( ok )</w:t>
-      </w:r>
+        <w:t>(</w:t>
+      </w:r>
+      <w:proofErr w:type="gramEnd"/>
+      <w:r>
+        <w:rPr>
+          <w:b/>
+          <w:bCs/>
+          <w:highlight w:val="yellow"/>
+          <w:lang w:val="en-US"/>
+        </w:rPr>
+        <w:t xml:space="preserve"> </w:t>
+      </w:r>
+      <w:proofErr w:type="gramStart"/>
+      <w:r>
+        <w:rPr>
+          <w:b/>
+          <w:bCs/>
+          <w:highlight w:val="yellow"/>
+          <w:lang w:val="en-US"/>
+        </w:rPr>
+        <w:t>ok )</w:t>
+      </w:r>
+      <w:proofErr w:type="gramEnd"/>
     </w:p>
     <w:p>
       <w:pPr>
@@ -492,6 +675,7 @@
         </w:rPr>
         <w:t xml:space="preserve"> </w:t>
       </w:r>
+      <w:proofErr w:type="gramStart"/>
       <w:r>
         <w:rPr>
           <w:b/>
@@ -510,8 +694,29 @@
           <w:highlight w:val="yellow"/>
           <w:lang w:val="en-US"/>
         </w:rPr>
-        <w:t>( ok )</w:t>
-      </w:r>
+        <w:t>(</w:t>
+      </w:r>
+      <w:proofErr w:type="gramEnd"/>
+      <w:r>
+        <w:rPr>
+          <w:b/>
+          <w:bCs/>
+          <w:highlight w:val="yellow"/>
+          <w:lang w:val="en-US"/>
+        </w:rPr>
+        <w:t xml:space="preserve"> </w:t>
+      </w:r>
+      <w:proofErr w:type="gramStart"/>
+      <w:r>
+        <w:rPr>
+          <w:b/>
+          <w:bCs/>
+          <w:highlight w:val="yellow"/>
+          <w:lang w:val="en-US"/>
+        </w:rPr>
+        <w:t>ok )</w:t>
+      </w:r>
+      <w:proofErr w:type="gramEnd"/>
     </w:p>
     <w:p>
       <w:pPr>
@@ -592,6 +797,7 @@
         <w:t xml:space="preserve"> </w:t>
       </w:r>
       <w:proofErr w:type="spellStart"/>
+      <w:proofErr w:type="gramStart"/>
       <w:r>
         <w:rPr>
           <w:b/>
@@ -624,16 +830,37 @@
           <w:highlight w:val="yellow"/>
           <w:lang w:val="en-US"/>
         </w:rPr>
-        <w:t>( ok )</w:t>
-      </w:r>
-      <w:r>
-        <w:rPr>
-          <w:b/>
-          <w:bCs/>
+        <w:t>(</w:t>
+      </w:r>
+      <w:proofErr w:type="gramEnd"/>
+      <w:r>
+        <w:rPr>
+          <w:b/>
+          <w:bCs/>
+          <w:highlight w:val="yellow"/>
           <w:lang w:val="en-US"/>
         </w:rPr>
         <w:t xml:space="preserve"> </w:t>
       </w:r>
+      <w:proofErr w:type="gramStart"/>
+      <w:r>
+        <w:rPr>
+          <w:b/>
+          <w:bCs/>
+          <w:highlight w:val="yellow"/>
+          <w:lang w:val="en-US"/>
+        </w:rPr>
+        <w:t>ok )</w:t>
+      </w:r>
+      <w:proofErr w:type="gramEnd"/>
+      <w:r>
+        <w:rPr>
+          <w:b/>
+          <w:bCs/>
+          <w:lang w:val="en-US"/>
+        </w:rPr>
+        <w:t xml:space="preserve"> </w:t>
+      </w:r>
     </w:p>
     <w:p>
       <w:pPr>
@@ -694,6 +921,7 @@
         </w:rPr>
         <w:t xml:space="preserve"> </w:t>
       </w:r>
+      <w:proofErr w:type="gramStart"/>
       <w:r>
         <w:rPr>
           <w:b/>
@@ -701,7 +929,17 @@
           <w:highlight w:val="yellow"/>
           <w:lang w:val="en-US"/>
         </w:rPr>
-        <w:t>( ok )</w:t>
+        <w:t>( ok</w:t>
+      </w:r>
+      <w:proofErr w:type="gramEnd"/>
+      <w:r>
+        <w:rPr>
+          <w:b/>
+          <w:bCs/>
+          <w:highlight w:val="yellow"/>
+          <w:lang w:val="en-US"/>
+        </w:rPr>
+        <w:t xml:space="preserve"> )</w:t>
       </w:r>
       <w:r>
         <w:rPr>
@@ -742,7 +980,16 @@
           <w:bCs/>
           <w:lang w:val="en-US"/>
         </w:rPr>
-        <w:t>python ost_awb.py "Paiement de dividendes en espèce"</w:t>
+        <w:t>python ost_awb.py "Paiement de dividendes en espèce</w:t>
+      </w:r>
+      <w:proofErr w:type="gramStart"/>
+      <w:r>
+        <w:rPr>
+          <w:b/>
+          <w:bCs/>
+          <w:lang w:val="en-US"/>
+        </w:rPr>
+        <w:t>"</w:t>
       </w:r>
       <w:r>
         <w:rPr>
@@ -759,8 +1006,29 @@
           <w:highlight w:val="yellow"/>
           <w:lang w:val="en-US"/>
         </w:rPr>
-        <w:t>( ok )</w:t>
-      </w:r>
+        <w:t>(</w:t>
+      </w:r>
+      <w:proofErr w:type="gramEnd"/>
+      <w:r>
+        <w:rPr>
+          <w:b/>
+          <w:bCs/>
+          <w:highlight w:val="yellow"/>
+          <w:lang w:val="en-US"/>
+        </w:rPr>
+        <w:t xml:space="preserve"> </w:t>
+      </w:r>
+      <w:proofErr w:type="gramStart"/>
+      <w:r>
+        <w:rPr>
+          <w:b/>
+          <w:bCs/>
+          <w:highlight w:val="yellow"/>
+          <w:lang w:val="en-US"/>
+        </w:rPr>
+        <w:t>ok )</w:t>
+      </w:r>
+      <w:proofErr w:type="gramEnd"/>
     </w:p>
     <w:p>
       <w:pPr>
@@ -850,6 +1118,7 @@
           <w:lang w:val="en-US"/>
         </w:rPr>
       </w:pPr>
+      <w:proofErr w:type="gramStart"/>
       <w:r>
         <w:rPr>
           <w:b/>
@@ -857,8 +1126,9 @@
           <w:color w:val="00B050"/>
           <w:lang w:val="en-US"/>
         </w:rPr>
-        <w:t>MegaCommon : </w:t>
-      </w:r>
+        <w:t>MegaCommon :</w:t>
+      </w:r>
+      <w:proofErr w:type="gramEnd"/>
       <w:r>
         <w:rPr>
           <w:b/>
@@ -866,6 +1136,15 @@
           <w:color w:val="00B050"/>
           <w:lang w:val="en-US"/>
         </w:rPr>
+        <w:t> </w:t>
+      </w:r>
+      <w:r>
+        <w:rPr>
+          <w:b/>
+          <w:bCs/>
+          <w:color w:val="00B050"/>
+          <w:lang w:val="en-US"/>
+        </w:rPr>
         <w:br/>
       </w:r>
       <w:r>
@@ -885,6 +1164,7 @@
           <w:lang w:val="en-US"/>
         </w:rPr>
       </w:pPr>
+      <w:proofErr w:type="gramStart"/>
       <w:r>
         <w:rPr>
           <w:b/>
@@ -892,7 +1172,17 @@
           <w:color w:val="00B050"/>
           <w:lang w:val="en-US"/>
         </w:rPr>
-        <w:t xml:space="preserve">Megacor : </w:t>
+        <w:t>Megacor :</w:t>
+      </w:r>
+      <w:proofErr w:type="gramEnd"/>
+      <w:r>
+        <w:rPr>
+          <w:b/>
+          <w:bCs/>
+          <w:color w:val="00B050"/>
+          <w:lang w:val="en-US"/>
+        </w:rPr>
+        <w:t xml:space="preserve"> </w:t>
       </w:r>
       <w:r>
         <w:rPr>
@@ -1209,8 +1499,18 @@
           <w:bCs/>
           <w:lang w:val="en-US"/>
         </w:rPr>
-        <w:t>foreach ($m in $modules) {</w:t>
-      </w:r>
+        <w:t>foreach ($m in $</w:t>
+      </w:r>
+      <w:proofErr w:type="gramStart"/>
+      <w:r>
+        <w:rPr>
+          <w:b/>
+          <w:bCs/>
+          <w:lang w:val="en-US"/>
+        </w:rPr>
+        <w:t>modules) {</w:t>
+      </w:r>
+      <w:proofErr w:type="gramEnd"/>
     </w:p>
     <w:p>
       <w:pPr>
@@ -1330,7 +1630,34 @@
           <w:bCs/>
           <w:lang w:val="en-US"/>
         </w:rPr>
-        <w:t xml:space="preserve">        Write-Host "ECHEC sur $m : $($_.</w:t>
+        <w:t xml:space="preserve">        Write-Host "ECHEC sur $</w:t>
+      </w:r>
+      <w:proofErr w:type="gramStart"/>
+      <w:r>
+        <w:rPr>
+          <w:b/>
+          <w:bCs/>
+          <w:lang w:val="en-US"/>
+        </w:rPr>
+        <w:t>m :</w:t>
+      </w:r>
+      <w:proofErr w:type="gramEnd"/>
+      <w:r>
+        <w:rPr>
+          <w:b/>
+          <w:bCs/>
+          <w:lang w:val="en-US"/>
+        </w:rPr>
+        <w:t xml:space="preserve"> $($</w:t>
+      </w:r>
+      <w:proofErr w:type="gramStart"/>
+      <w:r>
+        <w:rPr>
+          <w:b/>
+          <w:bCs/>
+          <w:lang w:val="en-US"/>
+        </w:rPr>
+        <w:t>_.</w:t>
       </w:r>
       <w:proofErr w:type="spellStart"/>
       <w:r>
@@ -1342,6 +1669,7 @@
         <w:t>Exception.Message</w:t>
       </w:r>
       <w:proofErr w:type="spellEnd"/>
+      <w:proofErr w:type="gramEnd"/>
       <w:r>
         <w:rPr>
           <w:b/>
@@ -1522,6 +1850,7 @@
         </w:rPr>
         <w:br/>
       </w:r>
+      <w:proofErr w:type="gramStart"/>
       <w:r>
         <w:rPr>
           <w:b/>
@@ -1531,7 +1860,19 @@
           <w:color w:val="00B050"/>
           <w:lang w:val="en-US"/>
         </w:rPr>
-        <w:t>Custody : </w:t>
+        <w:t>Custody :</w:t>
+      </w:r>
+      <w:proofErr w:type="gramEnd"/>
+      <w:r>
+        <w:rPr>
+          <w:b/>
+          <w:bCs/>
+          <w:i/>
+          <w:iCs/>
+          <w:color w:val="00B050"/>
+          <w:lang w:val="en-US"/>
+        </w:rPr>
+        <w:t> </w:t>
       </w:r>
       <w:r>
         <w:rPr>
@@ -1564,6 +1905,7 @@
         </w:rPr>
         <w:t xml:space="preserve"> </w:t>
       </w:r>
+      <w:proofErr w:type="gramStart"/>
       <w:r>
         <w:rPr>
           <w:b/>
@@ -1571,7 +1913,17 @@
           <w:highlight w:val="yellow"/>
           <w:lang w:val="en-US"/>
         </w:rPr>
-        <w:t>( ok )</w:t>
+        <w:t>( ok</w:t>
+      </w:r>
+      <w:proofErr w:type="gramEnd"/>
+      <w:r>
+        <w:rPr>
+          <w:b/>
+          <w:bCs/>
+          <w:highlight w:val="yellow"/>
+          <w:lang w:val="en-US"/>
+        </w:rPr>
+        <w:t xml:space="preserve"> )</w:t>
       </w:r>
     </w:p>
     <w:p>
@@ -1628,6 +1980,7 @@
         </w:rPr>
         <w:t xml:space="preserve"> </w:t>
       </w:r>
+      <w:proofErr w:type="gramStart"/>
       <w:r>
         <w:rPr>
           <w:b/>
@@ -1646,8 +1999,9 @@
           <w:highlight w:val="yellow"/>
           <w:lang w:val="en-US"/>
         </w:rPr>
-        <w:t xml:space="preserve">( </w:t>
-      </w:r>
+        <w:t>(</w:t>
+      </w:r>
+      <w:proofErr w:type="gramEnd"/>
       <w:r>
         <w:rPr>
           <w:b/>
@@ -1655,8 +2009,18 @@
           <w:highlight w:val="yellow"/>
           <w:lang w:val="en-US"/>
         </w:rPr>
+        <w:t xml:space="preserve"> </w:t>
+      </w:r>
+      <w:r>
+        <w:rPr>
+          <w:b/>
+          <w:bCs/>
+          <w:highlight w:val="yellow"/>
+          <w:lang w:val="en-US"/>
+        </w:rPr>
         <w:t xml:space="preserve">not </w:t>
       </w:r>
+      <w:proofErr w:type="gramStart"/>
       <w:r>
         <w:rPr>
           <w:b/>
@@ -1666,6 +2030,7 @@
         </w:rPr>
         <w:t>ok )</w:t>
       </w:r>
+      <w:proofErr w:type="gramEnd"/>
     </w:p>
     <w:p>
       <w:pPr>
@@ -1971,6 +2336,7 @@
         <w:lastRenderedPageBreak/>
         <w:br/>
       </w:r>
+      <w:proofErr w:type="gramStart"/>
       <w:r>
         <w:rPr>
           <w:b/>
@@ -1980,7 +2346,19 @@
           <w:color w:val="EE0000"/>
           <w:lang w:val="en-US"/>
         </w:rPr>
-        <w:t>CDG : </w:t>
+        <w:t>CDG :</w:t>
+      </w:r>
+      <w:proofErr w:type="gramEnd"/>
+      <w:r>
+        <w:rPr>
+          <w:b/>
+          <w:bCs/>
+          <w:i/>
+          <w:iCs/>
+          <w:color w:val="EE0000"/>
+          <w:lang w:val="en-US"/>
+        </w:rPr>
+        <w:t> </w:t>
       </w:r>
     </w:p>
     <w:p>
@@ -2326,6 +2704,7 @@
         </w:rPr>
         <w:br/>
       </w:r>
+      <w:proofErr w:type="gramStart"/>
       <w:r>
         <w:rPr>
           <w:b/>
@@ -2335,7 +2714,19 @@
           <w:color w:val="00B050"/>
           <w:lang w:val="en-US"/>
         </w:rPr>
-        <w:t>Custody : </w:t>
+        <w:t>Custody :</w:t>
+      </w:r>
+      <w:proofErr w:type="gramEnd"/>
+      <w:r>
+        <w:rPr>
+          <w:b/>
+          <w:bCs/>
+          <w:i/>
+          <w:iCs/>
+          <w:color w:val="00B050"/>
+          <w:lang w:val="en-US"/>
+        </w:rPr>
+        <w:t> </w:t>
       </w:r>
       <w:r>
         <w:rPr>
@@ -2395,8 +2786,19 @@
           <w:highlight w:val="yellow"/>
           <w:lang w:val="en-US"/>
         </w:rPr>
-        <w:t>(ok )</w:t>
-      </w:r>
+        <w:t>(</w:t>
+      </w:r>
+      <w:proofErr w:type="gramStart"/>
+      <w:r>
+        <w:rPr>
+          <w:b/>
+          <w:bCs/>
+          <w:highlight w:val="yellow"/>
+          <w:lang w:val="en-US"/>
+        </w:rPr>
+        <w:t>ok )</w:t>
+      </w:r>
+      <w:proofErr w:type="gramEnd"/>
     </w:p>
     <w:p>
       <w:pPr>
@@ -2452,6 +2854,7 @@
         </w:rPr>
         <w:t xml:space="preserve"> </w:t>
       </w:r>
+      <w:proofErr w:type="gramStart"/>
       <w:r>
         <w:rPr>
           <w:b/>
@@ -2470,8 +2873,9 @@
           <w:highlight w:val="yellow"/>
           <w:lang w:val="en-US"/>
         </w:rPr>
-        <w:t xml:space="preserve">( </w:t>
-      </w:r>
+        <w:t>(</w:t>
+      </w:r>
+      <w:proofErr w:type="gramEnd"/>
       <w:r>
         <w:rPr>
           <w:b/>
@@ -2479,8 +2883,18 @@
           <w:highlight w:val="yellow"/>
           <w:lang w:val="en-US"/>
         </w:rPr>
+        <w:t xml:space="preserve"> </w:t>
+      </w:r>
+      <w:r>
+        <w:rPr>
+          <w:b/>
+          <w:bCs/>
+          <w:highlight w:val="yellow"/>
+          <w:lang w:val="en-US"/>
+        </w:rPr>
         <w:t xml:space="preserve">not </w:t>
       </w:r>
+      <w:proofErr w:type="gramStart"/>
       <w:r>
         <w:rPr>
           <w:b/>
@@ -2490,6 +2904,7 @@
         </w:rPr>
         <w:t>ok )</w:t>
       </w:r>
+      <w:proofErr w:type="gramEnd"/>
     </w:p>
     <w:p>
       <w:pPr>
@@ -2512,8 +2927,21 @@
           <w:color w:val="EE0000"/>
           <w:lang w:val="en-US"/>
         </w:rPr>
-        <w:t>Process RL_CDG :</w:t>
-      </w:r>
+        <w:t>Process RL_</w:t>
+      </w:r>
+      <w:proofErr w:type="gramStart"/>
+      <w:r>
+        <w:rPr>
+          <w:b/>
+          <w:bCs/>
+          <w:i/>
+          <w:iCs/>
+          <w:color w:val="EE0000"/>
+          <w:lang w:val="en-US"/>
+        </w:rPr>
+        <w:t>CDG :</w:t>
+      </w:r>
+      <w:proofErr w:type="gramEnd"/>
       <w:r>
         <w:rPr>
           <w:color w:val="EE0000"/>
@@ -2543,6 +2971,7 @@
         <w:t xml:space="preserve"> </w:t>
       </w:r>
       <w:proofErr w:type="spellStart"/>
+      <w:proofErr w:type="gramStart"/>
       <w:r>
         <w:rPr>
           <w:lang w:val="en-US"/>
@@ -2554,7 +2983,28 @@
         <w:rPr>
           <w:lang w:val="en-US"/>
         </w:rPr>
-        <w:t xml:space="preserve">  ( not ok ) </w:t>
+        <w:t xml:space="preserve">  (</w:t>
+      </w:r>
+      <w:proofErr w:type="gramEnd"/>
+      <w:r>
+        <w:rPr>
+          <w:lang w:val="en-US"/>
+        </w:rPr>
+        <w:t xml:space="preserve"> not </w:t>
+      </w:r>
+      <w:proofErr w:type="gramStart"/>
+      <w:r>
+        <w:rPr>
+          <w:lang w:val="en-US"/>
+        </w:rPr>
+        <w:t>ok )</w:t>
+      </w:r>
+      <w:proofErr w:type="gramEnd"/>
+      <w:r>
+        <w:rPr>
+          <w:lang w:val="en-US"/>
+        </w:rPr>
+        <w:t xml:space="preserve"> </w:t>
       </w:r>
     </w:p>
     <w:p>
@@ -2645,22 +3095,95 @@
         </w:rPr>
         <w:t>Chaque fois que tu modifies ton code, dans Git Bash :</w:t>
       </w:r>
-    </w:p>
-    <w:p>
-      <w:pPr>
-        <w:rPr>
-          <w:lang w:val="fr-CA"/>
-        </w:rPr>
-      </w:pPr>
-      <w:r>
-        <w:rPr>
-          <w:lang w:val="fr-CA"/>
-        </w:rPr>
-        <w:t xml:space="preserve">git </w:t>
+      <w:r>
+        <w:rPr>
+          <w:b/>
+          <w:bCs/>
+          <w:i/>
+          <w:iCs/>
+          <w:lang w:val="fr-CA"/>
+        </w:rPr>
+        <w:br/>
+      </w:r>
+      <w:r>
+        <w:rPr>
+          <w:b/>
+          <w:bCs/>
+          <w:i/>
+          <w:iCs/>
+          <w:lang w:val="fr-CA"/>
+        </w:rPr>
+        <w:br/>
+      </w:r>
+      <w:r>
+        <w:rPr>
+          <w:i/>
+          <w:iCs/>
+          <w:lang w:val="fr-CA"/>
+        </w:rPr>
+        <w:t>cd "Desktop/Megara/</w:t>
       </w:r>
       <w:proofErr w:type="spellStart"/>
       <w:r>
         <w:rPr>
+          <w:i/>
+          <w:iCs/>
+          <w:lang w:val="fr-CA"/>
+        </w:rPr>
+        <w:t>TNR_Process_Manuels</w:t>
+      </w:r>
+      <w:proofErr w:type="spellEnd"/>
+      <w:r>
+        <w:rPr>
+          <w:i/>
+          <w:iCs/>
+          <w:lang w:val="fr-CA"/>
+        </w:rPr>
+        <w:t>/</w:t>
+      </w:r>
+      <w:proofErr w:type="spellStart"/>
+      <w:r>
+        <w:rPr>
+          <w:i/>
+          <w:iCs/>
+          <w:lang w:val="fr-CA"/>
+        </w:rPr>
+        <w:t>Scrapping</w:t>
+      </w:r>
+      <w:proofErr w:type="spellEnd"/>
+      <w:r>
+        <w:rPr>
+          <w:i/>
+          <w:iCs/>
+          <w:lang w:val="fr-CA"/>
+        </w:rPr>
+        <w:t>"</w:t>
+      </w:r>
+    </w:p>
+    <w:p>
+      <w:pPr>
+        <w:rPr>
+          <w:lang w:val="fr-CA"/>
+        </w:rPr>
+      </w:pPr>
+      <w:proofErr w:type="gramStart"/>
+      <w:r>
+        <w:rPr>
+          <w:lang w:val="fr-CA"/>
+        </w:rPr>
+        <w:t>git</w:t>
+      </w:r>
+      <w:proofErr w:type="gramEnd"/>
+      <w:r>
+        <w:rPr>
+          <w:lang w:val="fr-CA"/>
+        </w:rPr>
+        <w:t xml:space="preserve"> </w:t>
+      </w:r>
+      <w:proofErr w:type="spellStart"/>
+      <w:proofErr w:type="gramStart"/>
+      <w:r>
+        <w:rPr>
           <w:lang w:val="fr-CA"/>
         </w:rPr>
         <w:t>add</w:t>
@@ -2672,44 +3195,61 @@
         </w:rPr>
         <w:t xml:space="preserve"> .</w:t>
       </w:r>
-    </w:p>
-    <w:p>
-      <w:pPr>
-        <w:rPr>
-          <w:lang w:val="fr-CA"/>
-        </w:rPr>
-      </w:pPr>
-      <w:r>
-        <w:rPr>
-          <w:lang w:val="fr-CA"/>
-        </w:rPr>
-        <w:t>git commit -m "Description de ce que tu as changé"</w:t>
-      </w:r>
-    </w:p>
-    <w:p>
-      <w:pPr>
-        <w:rPr>
-          <w:lang w:val="en-US"/>
-        </w:rPr>
-      </w:pPr>
-      <w:r>
-        <w:rPr>
-          <w:lang w:val="en-US"/>
-        </w:rPr>
-        <w:t>git push</w:t>
-      </w:r>
-    </w:p>
-    <w:p>
-      <w:pPr>
-        <w:rPr>
-          <w:lang w:val="en-US"/>
-        </w:rPr>
-      </w:pPr>
-    </w:p>
-    <w:p>
-      <w:pPr>
-        <w:rPr>
-          <w:lang w:val="en-US"/>
+      <w:proofErr w:type="gramEnd"/>
+    </w:p>
+    <w:p>
+      <w:pPr>
+        <w:rPr>
+          <w:lang w:val="fr-CA"/>
+        </w:rPr>
+      </w:pPr>
+      <w:proofErr w:type="gramStart"/>
+      <w:r>
+        <w:rPr>
+          <w:lang w:val="fr-CA"/>
+        </w:rPr>
+        <w:t>git</w:t>
+      </w:r>
+      <w:proofErr w:type="gramEnd"/>
+      <w:r>
+        <w:rPr>
+          <w:lang w:val="fr-CA"/>
+        </w:rPr>
+        <w:t xml:space="preserve"> commit -m "Description de ce que tu as changé"</w:t>
+      </w:r>
+    </w:p>
+    <w:p>
+      <w:pPr>
+        <w:rPr>
+          <w:lang w:val="fr-CA"/>
+        </w:rPr>
+      </w:pPr>
+      <w:proofErr w:type="gramStart"/>
+      <w:r>
+        <w:rPr>
+          <w:lang w:val="fr-CA"/>
+        </w:rPr>
+        <w:t>git</w:t>
+      </w:r>
+      <w:proofErr w:type="gramEnd"/>
+      <w:r>
+        <w:rPr>
+          <w:lang w:val="fr-CA"/>
+        </w:rPr>
+        <w:t xml:space="preserve"> push</w:t>
+      </w:r>
+    </w:p>
+    <w:p>
+      <w:pPr>
+        <w:rPr>
+          <w:lang w:val="fr-CA"/>
+        </w:rPr>
+      </w:pPr>
+    </w:p>
+    <w:p>
+      <w:pPr>
+        <w:rPr>
+          <w:lang w:val="fr-CA"/>
         </w:rPr>
       </w:pPr>
     </w:p>
@@ -2751,6 +3291,7 @@
         </w:rPr>
       </w:pPr>
       <w:proofErr w:type="spellStart"/>
+      <w:proofErr w:type="gramStart"/>
       <w:r>
         <w:rPr>
           <w:lang w:val="fr-CA"/>
@@ -2758,6 +3299,7 @@
         <w:t>fastapi</w:t>
       </w:r>
       <w:proofErr w:type="spellEnd"/>
+      <w:proofErr w:type="gramEnd"/>
       <w:r>
         <w:rPr>
           <w:lang w:val="fr-CA"/>
@@ -2790,6 +3332,7 @@
         </w:rPr>
       </w:pPr>
       <w:proofErr w:type="spellStart"/>
+      <w:proofErr w:type="gramStart"/>
       <w:r>
         <w:rPr>
           <w:lang w:val="fr-CA"/>
@@ -2797,6 +3340,7 @@
         <w:t>uvicorn</w:t>
       </w:r>
       <w:proofErr w:type="spellEnd"/>
+      <w:proofErr w:type="gramEnd"/>
       <w:r>
         <w:rPr>
           <w:lang w:val="fr-CA"/>
@@ -2829,6 +3373,7 @@
         </w:rPr>
       </w:pPr>
       <w:proofErr w:type="spellStart"/>
+      <w:proofErr w:type="gramStart"/>
       <w:r>
         <w:rPr>
           <w:lang w:val="fr-CA"/>
@@ -2836,6 +3381,7 @@
         <w:t>sqlalchemy</w:t>
       </w:r>
       <w:proofErr w:type="spellEnd"/>
+      <w:proofErr w:type="gramEnd"/>
       <w:r>
         <w:rPr>
           <w:lang w:val="fr-CA"/>
@@ -2854,6 +3400,7 @@
         </w:rPr>
       </w:pPr>
       <w:proofErr w:type="spellStart"/>
+      <w:proofErr w:type="gramStart"/>
       <w:r>
         <w:rPr>
           <w:lang w:val="fr-CA"/>
@@ -2861,6 +3408,7 @@
         <w:t>websockets</w:t>
       </w:r>
       <w:proofErr w:type="spellEnd"/>
+      <w:proofErr w:type="gramEnd"/>
       <w:r>
         <w:rPr>
           <w:lang w:val="fr-CA"/>
@@ -2879,6 +3427,7 @@
         </w:rPr>
       </w:pPr>
       <w:proofErr w:type="spellStart"/>
+      <w:proofErr w:type="gramStart"/>
       <w:r>
         <w:rPr>
           <w:lang w:val="fr-CA"/>
@@ -2886,6 +3435,7 @@
         <w:t>aiofiles</w:t>
       </w:r>
       <w:proofErr w:type="spellEnd"/>
+      <w:proofErr w:type="gramEnd"/>
       <w:r>
         <w:rPr>
           <w:lang w:val="fr-CA"/>
@@ -3027,6 +3577,7 @@
         </w:rPr>
       </w:pPr>
       <w:proofErr w:type="spellStart"/>
+      <w:proofErr w:type="gramStart"/>
       <w:r>
         <w:rPr>
           <w:lang w:val="fr-CA"/>
@@ -3034,6 +3585,7 @@
         <w:t>executions</w:t>
       </w:r>
       <w:proofErr w:type="spellEnd"/>
+      <w:proofErr w:type="gramEnd"/>
       <w:r>
         <w:rPr>
           <w:lang w:val="fr-CA"/>
@@ -3052,11 +3604,19 @@
         </w:rPr>
       </w:pPr>
       <w:proofErr w:type="spellStart"/>
-      <w:r>
-        <w:rPr>
-          <w:lang w:val="fr-CA"/>
-        </w:rPr>
-        <w:t>execution_logs</w:t>
+      <w:proofErr w:type="gramStart"/>
+      <w:r>
+        <w:rPr>
+          <w:lang w:val="fr-CA"/>
+        </w:rPr>
+        <w:t>execution</w:t>
+      </w:r>
+      <w:proofErr w:type="gramEnd"/>
+      <w:r>
+        <w:rPr>
+          <w:lang w:val="fr-CA"/>
+        </w:rPr>
+        <w:t>_logs</w:t>
       </w:r>
       <w:proofErr w:type="spellEnd"/>
       <w:r>
@@ -3204,7 +3764,35 @@
           <w:lang w:val="fr-CA"/>
           <w14:ligatures w14:val="none"/>
         </w:rPr>
-        <w:t>├── requirements.txt   [OK] liste des outils installés</w:t>
+        <w:t>├── requirements.txt</w:t>
+      </w:r>
+      <w:proofErr w:type="gramStart"/>
+      <w:r>
+        <w:rPr>
+          <w:rFonts w:ascii="Courier New" w:eastAsia="Times New Roman" w:hAnsi="Courier New" w:cs="Courier New"/>
+          <w:color w:val="8C8C8C"/>
+          <w:kern w:val="0"/>
+          <w:sz w:val="18"/>
+          <w:szCs w:val="18"/>
+          <w:shd w:val="clear" w:color="auto" w:fill="262626"/>
+          <w:lang w:val="fr-CA"/>
+          <w14:ligatures w14:val="none"/>
+        </w:rPr>
+        <w:t xml:space="preserve">   [</w:t>
+      </w:r>
+      <w:proofErr w:type="gramEnd"/>
+      <w:r>
+        <w:rPr>
+          <w:rFonts w:ascii="Courier New" w:eastAsia="Times New Roman" w:hAnsi="Courier New" w:cs="Courier New"/>
+          <w:color w:val="8C8C8C"/>
+          <w:kern w:val="0"/>
+          <w:sz w:val="18"/>
+          <w:szCs w:val="18"/>
+          <w:shd w:val="clear" w:color="auto" w:fill="262626"/>
+          <w:lang w:val="fr-CA"/>
+          <w14:ligatures w14:val="none"/>
+        </w:rPr>
+        <w:t>OK] liste des outils installés</w:t>
       </w:r>
     </w:p>
     <w:p>
@@ -3256,7 +3844,35 @@
           <w:lang w:val="fr-CA"/>
           <w14:ligatures w14:val="none"/>
         </w:rPr>
-        <w:t xml:space="preserve">├── database.py        [OK] connexion à </w:t>
+        <w:t xml:space="preserve">├── database.py     </w:t>
+      </w:r>
+      <w:proofErr w:type="gramStart"/>
+      <w:r>
+        <w:rPr>
+          <w:rFonts w:ascii="Courier New" w:eastAsia="Times New Roman" w:hAnsi="Courier New" w:cs="Courier New"/>
+          <w:color w:val="8C8C8C"/>
+          <w:kern w:val="0"/>
+          <w:sz w:val="18"/>
+          <w:szCs w:val="18"/>
+          <w:shd w:val="clear" w:color="auto" w:fill="262626"/>
+          <w:lang w:val="fr-CA"/>
+          <w14:ligatures w14:val="none"/>
+        </w:rPr>
+        <w:t xml:space="preserve">   [</w:t>
+      </w:r>
+      <w:proofErr w:type="gramEnd"/>
+      <w:r>
+        <w:rPr>
+          <w:rFonts w:ascii="Courier New" w:eastAsia="Times New Roman" w:hAnsi="Courier New" w:cs="Courier New"/>
+          <w:color w:val="8C8C8C"/>
+          <w:kern w:val="0"/>
+          <w:sz w:val="18"/>
+          <w:szCs w:val="18"/>
+          <w:shd w:val="clear" w:color="auto" w:fill="262626"/>
+          <w:lang w:val="fr-CA"/>
+          <w14:ligatures w14:val="none"/>
+        </w:rPr>
+        <w:t xml:space="preserve">OK] connexion à </w:t>
       </w:r>
       <w:proofErr w:type="spellStart"/>
       <w:r>
@@ -3336,7 +3952,63 @@
           <w:lang w:val="en-US"/>
           <w14:ligatures w14:val="none"/>
         </w:rPr>
-        <w:t xml:space="preserve">├── models.py          [OK] tables : executions + </w:t>
+        <w:t xml:space="preserve">├── models.py       </w:t>
+      </w:r>
+      <w:proofErr w:type="gramStart"/>
+      <w:r>
+        <w:rPr>
+          <w:rFonts w:ascii="Courier New" w:eastAsia="Times New Roman" w:hAnsi="Courier New" w:cs="Courier New"/>
+          <w:color w:val="8C8C8C"/>
+          <w:kern w:val="0"/>
+          <w:sz w:val="18"/>
+          <w:szCs w:val="18"/>
+          <w:shd w:val="clear" w:color="auto" w:fill="262626"/>
+          <w:lang w:val="en-US"/>
+          <w14:ligatures w14:val="none"/>
+        </w:rPr>
+        <w:t xml:space="preserve">   [</w:t>
+      </w:r>
+      <w:proofErr w:type="gramEnd"/>
+      <w:r>
+        <w:rPr>
+          <w:rFonts w:ascii="Courier New" w:eastAsia="Times New Roman" w:hAnsi="Courier New" w:cs="Courier New"/>
+          <w:color w:val="8C8C8C"/>
+          <w:kern w:val="0"/>
+          <w:sz w:val="18"/>
+          <w:szCs w:val="18"/>
+          <w:shd w:val="clear" w:color="auto" w:fill="262626"/>
+          <w:lang w:val="en-US"/>
+          <w14:ligatures w14:val="none"/>
+        </w:rPr>
+        <w:t xml:space="preserve">OK] </w:t>
+      </w:r>
+      <w:proofErr w:type="gramStart"/>
+      <w:r>
+        <w:rPr>
+          <w:rFonts w:ascii="Courier New" w:eastAsia="Times New Roman" w:hAnsi="Courier New" w:cs="Courier New"/>
+          <w:color w:val="8C8C8C"/>
+          <w:kern w:val="0"/>
+          <w:sz w:val="18"/>
+          <w:szCs w:val="18"/>
+          <w:shd w:val="clear" w:color="auto" w:fill="262626"/>
+          <w:lang w:val="en-US"/>
+          <w14:ligatures w14:val="none"/>
+        </w:rPr>
+        <w:t>tables :</w:t>
+      </w:r>
+      <w:proofErr w:type="gramEnd"/>
+      <w:r>
+        <w:rPr>
+          <w:rFonts w:ascii="Courier New" w:eastAsia="Times New Roman" w:hAnsi="Courier New" w:cs="Courier New"/>
+          <w:color w:val="8C8C8C"/>
+          <w:kern w:val="0"/>
+          <w:sz w:val="18"/>
+          <w:szCs w:val="18"/>
+          <w:shd w:val="clear" w:color="auto" w:fill="262626"/>
+          <w:lang w:val="en-US"/>
+          <w14:ligatures w14:val="none"/>
+        </w:rPr>
+        <w:t xml:space="preserve"> executions + </w:t>
       </w:r>
       <w:proofErr w:type="spellStart"/>
       <w:r>
@@ -3403,7 +4075,35 @@
           <w:lang w:val="fr-CA"/>
           <w14:ligatures w14:val="none"/>
         </w:rPr>
-        <w:t xml:space="preserve">├── main.py            [OK] serveur </w:t>
+        <w:t xml:space="preserve">├── main.py         </w:t>
+      </w:r>
+      <w:proofErr w:type="gramStart"/>
+      <w:r>
+        <w:rPr>
+          <w:rFonts w:ascii="Courier New" w:eastAsia="Times New Roman" w:hAnsi="Courier New" w:cs="Courier New"/>
+          <w:color w:val="8C8C8C"/>
+          <w:kern w:val="0"/>
+          <w:sz w:val="18"/>
+          <w:szCs w:val="18"/>
+          <w:shd w:val="clear" w:color="auto" w:fill="262626"/>
+          <w:lang w:val="fr-CA"/>
+          <w14:ligatures w14:val="none"/>
+        </w:rPr>
+        <w:t xml:space="preserve">   [</w:t>
+      </w:r>
+      <w:proofErr w:type="gramEnd"/>
+      <w:r>
+        <w:rPr>
+          <w:rFonts w:ascii="Courier New" w:eastAsia="Times New Roman" w:hAnsi="Courier New" w:cs="Courier New"/>
+          <w:color w:val="8C8C8C"/>
+          <w:kern w:val="0"/>
+          <w:sz w:val="18"/>
+          <w:szCs w:val="18"/>
+          <w:shd w:val="clear" w:color="auto" w:fill="262626"/>
+          <w:lang w:val="fr-CA"/>
+          <w14:ligatures w14:val="none"/>
+        </w:rPr>
+        <w:t xml:space="preserve">OK] serveur </w:t>
       </w:r>
       <w:proofErr w:type="spellStart"/>
       <w:r>
@@ -3563,7 +4263,36 @@
           <w:lang w:val="en-US"/>
           <w14:ligatures w14:val="none"/>
         </w:rPr>
-        <w:t xml:space="preserve">    ├── __init__.py    [OK]</w:t>
+        <w:lastRenderedPageBreak/>
+        <w:t xml:space="preserve">    ├── __init__.py </w:t>
+      </w:r>
+      <w:proofErr w:type="gramStart"/>
+      <w:r>
+        <w:rPr>
+          <w:rFonts w:ascii="Courier New" w:eastAsia="Times New Roman" w:hAnsi="Courier New" w:cs="Courier New"/>
+          <w:color w:val="8C8C8C"/>
+          <w:kern w:val="0"/>
+          <w:sz w:val="18"/>
+          <w:szCs w:val="18"/>
+          <w:shd w:val="clear" w:color="auto" w:fill="262626"/>
+          <w:lang w:val="en-US"/>
+          <w14:ligatures w14:val="none"/>
+        </w:rPr>
+        <w:t xml:space="preserve">   [</w:t>
+      </w:r>
+      <w:proofErr w:type="gramEnd"/>
+      <w:r>
+        <w:rPr>
+          <w:rFonts w:ascii="Courier New" w:eastAsia="Times New Roman" w:hAnsi="Courier New" w:cs="Courier New"/>
+          <w:color w:val="8C8C8C"/>
+          <w:kern w:val="0"/>
+          <w:sz w:val="18"/>
+          <w:szCs w:val="18"/>
+          <w:shd w:val="clear" w:color="auto" w:fill="262626"/>
+          <w:lang w:val="en-US"/>
+          <w14:ligatures w14:val="none"/>
+        </w:rPr>
+        <w:t>OK]</w:t>
       </w:r>
     </w:p>
     <w:p>
@@ -3615,7 +4344,63 @@
           <w:lang w:val="en-US"/>
           <w14:ligatures w14:val="none"/>
         </w:rPr>
-        <w:t xml:space="preserve">    ├── clients.py     [OK] endpoints : AWB / BMCE / CDG / modules</w:t>
+        <w:t xml:space="preserve">    ├── clients.py  </w:t>
+      </w:r>
+      <w:proofErr w:type="gramStart"/>
+      <w:r>
+        <w:rPr>
+          <w:rFonts w:ascii="Courier New" w:eastAsia="Times New Roman" w:hAnsi="Courier New" w:cs="Courier New"/>
+          <w:color w:val="8C8C8C"/>
+          <w:kern w:val="0"/>
+          <w:sz w:val="18"/>
+          <w:szCs w:val="18"/>
+          <w:shd w:val="clear" w:color="auto" w:fill="262626"/>
+          <w:lang w:val="en-US"/>
+          <w14:ligatures w14:val="none"/>
+        </w:rPr>
+        <w:t xml:space="preserve">   [</w:t>
+      </w:r>
+      <w:proofErr w:type="gramEnd"/>
+      <w:r>
+        <w:rPr>
+          <w:rFonts w:ascii="Courier New" w:eastAsia="Times New Roman" w:hAnsi="Courier New" w:cs="Courier New"/>
+          <w:color w:val="8C8C8C"/>
+          <w:kern w:val="0"/>
+          <w:sz w:val="18"/>
+          <w:szCs w:val="18"/>
+          <w:shd w:val="clear" w:color="auto" w:fill="262626"/>
+          <w:lang w:val="en-US"/>
+          <w14:ligatures w14:val="none"/>
+        </w:rPr>
+        <w:t xml:space="preserve">OK] </w:t>
+      </w:r>
+      <w:proofErr w:type="gramStart"/>
+      <w:r>
+        <w:rPr>
+          <w:rFonts w:ascii="Courier New" w:eastAsia="Times New Roman" w:hAnsi="Courier New" w:cs="Courier New"/>
+          <w:color w:val="8C8C8C"/>
+          <w:kern w:val="0"/>
+          <w:sz w:val="18"/>
+          <w:szCs w:val="18"/>
+          <w:shd w:val="clear" w:color="auto" w:fill="262626"/>
+          <w:lang w:val="en-US"/>
+          <w14:ligatures w14:val="none"/>
+        </w:rPr>
+        <w:t>endpoints :</w:t>
+      </w:r>
+      <w:proofErr w:type="gramEnd"/>
+      <w:r>
+        <w:rPr>
+          <w:rFonts w:ascii="Courier New" w:eastAsia="Times New Roman" w:hAnsi="Courier New" w:cs="Courier New"/>
+          <w:color w:val="8C8C8C"/>
+          <w:kern w:val="0"/>
+          <w:sz w:val="18"/>
+          <w:szCs w:val="18"/>
+          <w:shd w:val="clear" w:color="auto" w:fill="262626"/>
+          <w:lang w:val="en-US"/>
+          <w14:ligatures w14:val="none"/>
+        </w:rPr>
+        <w:t xml:space="preserve"> AWB / BMCE / CDG / modules</w:t>
       </w:r>
     </w:p>
     <w:p>
@@ -3666,7 +4451,6 @@
           <w:lang w:val="en-US"/>
           <w14:ligatures w14:val="none"/>
         </w:rPr>
-        <w:lastRenderedPageBreak/>
         <w:t xml:space="preserve">    </w:t>
       </w:r>
       <w:r>
@@ -3680,9 +4464,9 @@
           <w:lang w:val="fr-CA"/>
           <w14:ligatures w14:val="none"/>
         </w:rPr>
-        <w:t xml:space="preserve">└── executions.py  [OK] </w:t>
-      </w:r>
-      <w:proofErr w:type="spellStart"/>
+        <w:t xml:space="preserve">└── </w:t>
+      </w:r>
+      <w:proofErr w:type="gramStart"/>
       <w:r>
         <w:rPr>
           <w:rFonts w:ascii="Courier New" w:eastAsia="Times New Roman" w:hAnsi="Courier New" w:cs="Courier New"/>
@@ -3694,9 +4478,9 @@
           <w:lang w:val="fr-CA"/>
           <w14:ligatures w14:val="none"/>
         </w:rPr>
-        <w:t>endpoints</w:t>
-      </w:r>
-      <w:proofErr w:type="spellEnd"/>
+        <w:t>executions.py  [</w:t>
+      </w:r>
+      <w:proofErr w:type="gramEnd"/>
       <w:r>
         <w:rPr>
           <w:rFonts w:ascii="Courier New" w:eastAsia="Times New Roman" w:hAnsi="Courier New" w:cs="Courier New"/>
@@ -3708,6 +4492,34 @@
           <w:lang w:val="fr-CA"/>
           <w14:ligatures w14:val="none"/>
         </w:rPr>
+        <w:t xml:space="preserve">OK] </w:t>
+      </w:r>
+      <w:proofErr w:type="spellStart"/>
+      <w:r>
+        <w:rPr>
+          <w:rFonts w:ascii="Courier New" w:eastAsia="Times New Roman" w:hAnsi="Courier New" w:cs="Courier New"/>
+          <w:color w:val="8C8C8C"/>
+          <w:kern w:val="0"/>
+          <w:sz w:val="18"/>
+          <w:szCs w:val="18"/>
+          <w:shd w:val="clear" w:color="auto" w:fill="262626"/>
+          <w:lang w:val="fr-CA"/>
+          <w14:ligatures w14:val="none"/>
+        </w:rPr>
+        <w:t>endpoints</w:t>
+      </w:r>
+      <w:proofErr w:type="spellEnd"/>
+      <w:r>
+        <w:rPr>
+          <w:rFonts w:ascii="Courier New" w:eastAsia="Times New Roman" w:hAnsi="Courier New" w:cs="Courier New"/>
+          <w:color w:val="8C8C8C"/>
+          <w:kern w:val="0"/>
+          <w:sz w:val="18"/>
+          <w:szCs w:val="18"/>
+          <w:shd w:val="clear" w:color="auto" w:fill="262626"/>
+          <w:lang w:val="fr-CA"/>
+          <w14:ligatures w14:val="none"/>
+        </w:rPr>
         <w:t xml:space="preserve"> : lancer / suivre / historique</w:t>
       </w:r>
     </w:p>
@@ -3937,8 +4749,16 @@
         <w:rPr>
           <w:lang w:val="en-US"/>
         </w:rPr>
-        <w:t xml:space="preserve"> qui :</w:t>
-      </w:r>
+        <w:t xml:space="preserve"> </w:t>
+      </w:r>
+      <w:proofErr w:type="gramStart"/>
+      <w:r>
+        <w:rPr>
+          <w:lang w:val="en-US"/>
+        </w:rPr>
+        <w:t>qui :</w:t>
+      </w:r>
+      <w:proofErr w:type="gramEnd"/>
     </w:p>
     <w:p>
       <w:pPr>
@@ -4172,11 +4992,19 @@
           <w:lang w:val="fr-CA"/>
         </w:rPr>
       </w:pPr>
-      <w:r>
-        <w:rPr>
-          <w:lang w:val="fr-CA"/>
-        </w:rPr>
-        <w:t xml:space="preserve">&lt;!-- Sans </w:t>
+      <w:proofErr w:type="gramStart"/>
+      <w:r>
+        <w:rPr>
+          <w:lang w:val="fr-CA"/>
+        </w:rPr>
+        <w:t>&lt;!--</w:t>
+      </w:r>
+      <w:proofErr w:type="gramEnd"/>
+      <w:r>
+        <w:rPr>
+          <w:lang w:val="fr-CA"/>
+        </w:rPr>
+        <w:t xml:space="preserve"> Sans </w:t>
       </w:r>
       <w:proofErr w:type="spellStart"/>
       <w:r>
@@ -4203,7 +5031,21 @@
         <w:rPr>
           <w:lang w:val="fr-CA"/>
         </w:rPr>
-        <w:t>&lt;div class="ma-carte"&gt;...&lt;/div&gt;   ← puis tu cherches le .</w:t>
+        <w:t>&lt;</w:t>
+      </w:r>
+      <w:proofErr w:type="gramStart"/>
+      <w:r>
+        <w:rPr>
+          <w:lang w:val="fr-CA"/>
+        </w:rPr>
+        <w:t>div</w:t>
+      </w:r>
+      <w:proofErr w:type="gramEnd"/>
+      <w:r>
+        <w:rPr>
+          <w:lang w:val="fr-CA"/>
+        </w:rPr>
+        <w:t xml:space="preserve"> class="ma-carte"&gt;...&lt;/div&gt;   ← puis tu cherches le .</w:t>
       </w:r>
       <w:proofErr w:type="spellStart"/>
       <w:r>
@@ -4227,11 +5069,19 @@
           <w:lang w:val="en-US"/>
         </w:rPr>
       </w:pPr>
-      <w:r>
-        <w:rPr>
-          <w:lang w:val="en-US"/>
-        </w:rPr>
-        <w:t>&lt;!-- Avec Tailwind --&gt;</w:t>
+      <w:proofErr w:type="gramStart"/>
+      <w:r>
+        <w:rPr>
+          <w:lang w:val="en-US"/>
+        </w:rPr>
+        <w:t>&lt;!--</w:t>
+      </w:r>
+      <w:proofErr w:type="gramEnd"/>
+      <w:r>
+        <w:rPr>
+          <w:lang w:val="en-US"/>
+        </w:rPr>
+        <w:t xml:space="preserve"> Avec Tailwind --&gt;</w:t>
       </w:r>
     </w:p>
     <w:p>
@@ -4254,11 +5104,47 @@
         <w:t>bg</w:t>
       </w:r>
       <w:proofErr w:type="spellEnd"/>
-      <w:r>
-        <w:rPr>
-          <w:lang w:val="en-US"/>
-        </w:rPr>
-        <w:t>-[#1a1d27] border border-[#2d3148] rounded-xl p-5"&gt;</w:t>
+      <w:proofErr w:type="gramStart"/>
+      <w:r>
+        <w:rPr>
+          <w:lang w:val="en-US"/>
+        </w:rPr>
+        <w:t>-[#</w:t>
+      </w:r>
+      <w:proofErr w:type="gramEnd"/>
+      <w:r>
+        <w:rPr>
+          <w:lang w:val="en-US"/>
+        </w:rPr>
+        <w:t>1a1d27</w:t>
+      </w:r>
+      <w:proofErr w:type="gramStart"/>
+      <w:r>
+        <w:rPr>
+          <w:lang w:val="en-US"/>
+        </w:rPr>
+        <w:t>] border</w:t>
+      </w:r>
+      <w:proofErr w:type="gramEnd"/>
+      <w:r>
+        <w:rPr>
+          <w:lang w:val="en-US"/>
+        </w:rPr>
+        <w:t xml:space="preserve"> border</w:t>
+      </w:r>
+      <w:proofErr w:type="gramStart"/>
+      <w:r>
+        <w:rPr>
+          <w:lang w:val="en-US"/>
+        </w:rPr>
+        <w:t>-[#</w:t>
+      </w:r>
+      <w:proofErr w:type="gramEnd"/>
+      <w:r>
+        <w:rPr>
+          <w:lang w:val="en-US"/>
+        </w:rPr>
+        <w:t>2d3148] rounded-xl p-5"&gt;</w:t>
       </w:r>
     </w:p>
     <w:p>
@@ -4311,6 +5197,7 @@
         <w:rPr>
           <w:lang w:val="fr-CA"/>
         </w:rPr>
+        <w:lastRenderedPageBreak/>
         <w:t xml:space="preserve">Sans </w:t>
       </w:r>
       <w:proofErr w:type="spellStart"/>
@@ -4371,7 +5258,6 @@
           <w:bCs/>
           <w:lang w:val="fr-CA"/>
         </w:rPr>
-        <w:lastRenderedPageBreak/>
         <w:t>TanStack</w:t>
       </w:r>
       <w:proofErr w:type="spellEnd"/>
@@ -4754,19 +5640,66 @@
     <w:p>
       <w:pPr>
         <w:rPr>
-          <w:b/>
-          <w:bCs/>
-          <w:i/>
-          <w:iCs/>
-          <w:lang w:val="fr-CA"/>
-        </w:rPr>
-      </w:pPr>
-      <w:r>
-        <w:rPr>
-          <w:b/>
-          <w:bCs/>
-          <w:i/>
-          <w:iCs/>
+          <w:i/>
+          <w:iCs/>
+          <w:lang w:val="fr-CA"/>
+        </w:rPr>
+      </w:pPr>
+    </w:p>
+    <w:p>
+      <w:pPr>
+        <w:rPr>
+          <w:i/>
+          <w:iCs/>
+          <w:lang w:val="fr-CA"/>
+        </w:rPr>
+      </w:pPr>
+    </w:p>
+    <w:p>
+      <w:pPr>
+        <w:rPr>
+          <w:i/>
+          <w:iCs/>
+          <w:lang w:val="fr-CA"/>
+        </w:rPr>
+      </w:pPr>
+    </w:p>
+    <w:p>
+      <w:pPr>
+        <w:rPr>
+          <w:i/>
+          <w:iCs/>
+          <w:lang w:val="fr-CA"/>
+        </w:rPr>
+      </w:pPr>
+    </w:p>
+    <w:p>
+      <w:pPr>
+        <w:rPr>
+          <w:i/>
+          <w:iCs/>
+          <w:lang w:val="fr-CA"/>
+        </w:rPr>
+      </w:pPr>
+    </w:p>
+    <w:p>
+      <w:pPr>
+        <w:rPr>
+          <w:b/>
+          <w:bCs/>
+          <w:i/>
+          <w:iCs/>
+          <w:color w:val="EE0000"/>
+          <w:lang w:val="fr-CA"/>
+        </w:rPr>
+      </w:pPr>
+      <w:r>
+        <w:rPr>
+          <w:b/>
+          <w:bCs/>
+          <w:i/>
+          <w:iCs/>
+          <w:color w:val="EE0000"/>
           <w:lang w:val="fr-CA"/>
         </w:rPr>
         <w:t>Si tu veux relancer plus tard</w:t>
@@ -4811,8 +5744,20 @@
           <w:iCs/>
           <w:lang w:val="en-US"/>
         </w:rPr>
-        <w:t>Terminal 1 :</w:t>
-      </w:r>
+        <w:t xml:space="preserve">Terminal </w:t>
+      </w:r>
+      <w:proofErr w:type="gramStart"/>
+      <w:r>
+        <w:rPr>
+          <w:b/>
+          <w:bCs/>
+          <w:i/>
+          <w:iCs/>
+          <w:lang w:val="en-US"/>
+        </w:rPr>
+        <w:t>1 :</w:t>
+      </w:r>
+      <w:proofErr w:type="gramEnd"/>
     </w:p>
     <w:p>
       <w:pPr>
@@ -4918,9 +5863,20 @@
           <w:iCs/>
           <w:lang w:val="en-US"/>
         </w:rPr>
-        <w:lastRenderedPageBreak/>
-        <w:t>Terminal 2 :</w:t>
-      </w:r>
+        <w:t xml:space="preserve">Terminal </w:t>
+      </w:r>
+      <w:proofErr w:type="gramStart"/>
+      <w:r>
+        <w:rPr>
+          <w:b/>
+          <w:bCs/>
+          <w:i/>
+          <w:iCs/>
+          <w:lang w:val="en-US"/>
+        </w:rPr>
+        <w:t>2 :</w:t>
+      </w:r>
+      <w:proofErr w:type="gramEnd"/>
     </w:p>
     <w:p>
       <w:pPr>
@@ -4964,6 +5920,7 @@
         <w:t>$</w:t>
       </w:r>
       <w:proofErr w:type="spellStart"/>
+      <w:proofErr w:type="gramStart"/>
       <w:r>
         <w:rPr>
           <w:b/>
@@ -4975,15 +5932,38 @@
         <w:t>env:PATH</w:t>
       </w:r>
       <w:proofErr w:type="spellEnd"/>
-      <w:r>
-        <w:rPr>
-          <w:b/>
-          <w:bCs/>
-          <w:i/>
-          <w:iCs/>
-          <w:lang w:val="en-US"/>
-        </w:rPr>
-        <w:t xml:space="preserve"> = "C:\tools\node-v22.13.0-win-x64;$env:PATH"</w:t>
+      <w:proofErr w:type="gramEnd"/>
+      <w:r>
+        <w:rPr>
+          <w:b/>
+          <w:bCs/>
+          <w:i/>
+          <w:iCs/>
+          <w:lang w:val="en-US"/>
+        </w:rPr>
+        <w:t xml:space="preserve"> = "</w:t>
+      </w:r>
+      <w:proofErr w:type="gramStart"/>
+      <w:r>
+        <w:rPr>
+          <w:b/>
+          <w:bCs/>
+          <w:i/>
+          <w:iCs/>
+          <w:lang w:val="en-US"/>
+        </w:rPr>
+        <w:t>C:\tools\node-v22.13.0-win-x64;$env:PATH</w:t>
+      </w:r>
+      <w:proofErr w:type="gramEnd"/>
+      <w:r>
+        <w:rPr>
+          <w:b/>
+          <w:bCs/>
+          <w:i/>
+          <w:iCs/>
+          <w:lang w:val="en-US"/>
+        </w:rPr>
+        <w:t>"</w:t>
       </w:r>
     </w:p>
     <w:p>
@@ -4997,6 +5977,7 @@
         </w:rPr>
       </w:pPr>
       <w:proofErr w:type="spellStart"/>
+      <w:proofErr w:type="gramStart"/>
       <w:r>
         <w:rPr>
           <w:b/>
@@ -5008,6 +5989,7 @@
         <w:t>npm</w:t>
       </w:r>
       <w:proofErr w:type="spellEnd"/>
+      <w:proofErr w:type="gramEnd"/>
       <w:r>
         <w:rPr>
           <w:b/>

</xml_diff>